<commit_message>
Puliendo plantillas de cartas
</commit_message>
<xml_diff>
--- a/MasterHelp.docx
+++ b/MasterHelp.docx
@@ -245,7 +245,10 @@
         <w:spacing w:after="120"/>
       </w:pPr>
       <w:r>
-        <w:t>9. Componente "Recuérdame"</w:t>
+        <w:t>9</w:t>
+      </w:r>
+      <w:r>
+        <w:t>. Funcionalidades adicionales</w:t>
       </w:r>
     </w:p>
     <w:p>
@@ -253,7 +256,13 @@
         <w:spacing w:after="120"/>
       </w:pPr>
       <w:r>
-        <w:t>10. Funcionalidades adicionales</w:t>
+        <w:t>1</w:t>
+      </w:r>
+      <w:r>
+        <w:t>0</w:t>
+      </w:r>
+      <w:r>
+        <w:t>. Acceso web y multi-dispositivo</w:t>
       </w:r>
     </w:p>
     <w:p>
@@ -261,15 +270,13 @@
         <w:spacing w:after="120"/>
       </w:pPr>
       <w:r>
-        <w:t>11. Acceso web y multi-dispositivo</w:t>
-      </w:r>
-    </w:p>
-    <w:p>
-      <w:pPr>
-        <w:spacing w:after="120"/>
-      </w:pPr>
-      <w:r>
-        <w:t>12. Roles de usuario: Master vs Jugador</w:t>
+        <w:t>1</w:t>
+      </w:r>
+      <w:r>
+        <w:t>1</w:t>
+      </w:r>
+      <w:r>
+        <w:t>. Roles de usuario: Master vs Jugador</w:t>
       </w:r>
     </w:p>
     <w:p>
@@ -1233,13 +1240,8 @@
       </w:r>
       <w:r>
         <w:lastRenderedPageBreak/>
-        <w:t xml:space="preserve">6.3 </w:t>
-      </w:r>
-      <w:proofErr w:type="spellStart"/>
-      <w:r>
-        <w:t>Combate</w:t>
-      </w:r>
-      <w:proofErr w:type="spellEnd"/>
+        <w:t>6.3 Combate</w:t>
+      </w:r>
     </w:p>
     <w:p>
       <w:pPr>
@@ -1459,15 +1461,7 @@
       </w:r>
       <w:r>
         <w:lastRenderedPageBreak/>
-        <w:t xml:space="preserve">6.4 </w:t>
-      </w:r>
-      <w:proofErr w:type="spellStart"/>
-      <w:r>
-        <w:t>Escenas</w:t>
-      </w:r>
-      <w:proofErr w:type="spellEnd"/>
-      <w:r>
-        <w:t xml:space="preserve"> (Scenes)</w:t>
+        <w:t>6.4 Escenas (Scenes)</w:t>
       </w:r>
     </w:p>
     <w:p>
@@ -2174,13 +2168,8 @@
       </w:r>
       <w:r>
         <w:lastRenderedPageBreak/>
-        <w:t xml:space="preserve">6.7 </w:t>
-      </w:r>
-      <w:proofErr w:type="spellStart"/>
-      <w:r>
-        <w:t>Bestiario</w:t>
-      </w:r>
-      <w:proofErr w:type="spellEnd"/>
+        <w:t>6.7 Bestiario</w:t>
+      </w:r>
     </w:p>
     <w:p>
       <w:pPr>
@@ -3151,7 +3140,30 @@
           <w:rFonts w:ascii="Calibri" w:hAnsi="Calibri"/>
         </w:rPr>
         <w:lastRenderedPageBreak/>
-        <w:t>9. Componente "Recuérdame"</w:t>
+        <w:t>9</w:t>
+      </w:r>
+      <w:r>
+        <w:rPr>
+          <w:rFonts w:ascii="Calibri" w:hAnsi="Calibri"/>
+        </w:rPr>
+        <w:t>. Funcionalidades adicionales</w:t>
+      </w:r>
+    </w:p>
+    <w:p>
+      <w:pPr>
+        <w:pStyle w:val="Ttulo2"/>
+      </w:pPr>
+      <w:r>
+        <w:rPr>
+          <w:rFonts w:ascii="Calibri" w:hAnsi="Calibri"/>
+        </w:rPr>
+        <w:t>9</w:t>
+      </w:r>
+      <w:r>
+        <w:rPr>
+          <w:rFonts w:ascii="Calibri" w:hAnsi="Calibri"/>
+        </w:rPr>
+        <w:t>.1 Importación/Exportación</w:t>
       </w:r>
     </w:p>
     <w:p>
@@ -3159,7 +3171,96 @@
         <w:spacing w:after="120"/>
       </w:pPr>
       <w:r>
-        <w:t>El componente "Recuérdame" aparece como un pequeño icono en el lateral de la pantalla, fuera del sidebar. Al pulsarlo, abre una vista con información contextual relevante basada en el mapa activo, el personaje seleccionado, el encuentro activo y otros elementos actuales.</w:t>
+        <w:t>Muchas herramientas permiten importar y exportar datos en formato Excel (.xlsx):</w:t>
+      </w:r>
+    </w:p>
+    <w:p>
+      <w:pPr>
+        <w:pStyle w:val="Listaconvietas"/>
+      </w:pPr>
+      <w:r>
+        <w:t>Mapas: exportar/importar la lista completa con sus configuraciones.</w:t>
+      </w:r>
+    </w:p>
+    <w:p>
+      <w:pPr>
+        <w:pStyle w:val="Listaconvietas"/>
+      </w:pPr>
+      <w:r>
+        <w:t>Bestiario: exportar/importar entradas de enemigos.</w:t>
+      </w:r>
+    </w:p>
+    <w:p>
+      <w:pPr>
+        <w:pStyle w:val="Listaconvietas"/>
+      </w:pPr>
+      <w:r>
+        <w:t>Personajes: exportar/importar fichas de personajes.</w:t>
+      </w:r>
+    </w:p>
+    <w:p>
+      <w:pPr>
+        <w:pStyle w:val="Listaconvietas"/>
+      </w:pPr>
+      <w:r>
+        <w:t>Conjuros: exportar/importar la lista de hechizos.</w:t>
+      </w:r>
+    </w:p>
+    <w:p>
+      <w:pPr>
+        <w:pStyle w:val="Listaconvietas"/>
+      </w:pPr>
+      <w:r>
+        <w:t>Campañas: exportar/importar datos de campañas.</w:t>
+      </w:r>
+    </w:p>
+    <w:p>
+      <w:pPr>
+        <w:pStyle w:val="Listaconvietas"/>
+      </w:pPr>
+      <w:r>
+        <w:t>Diario: exportar/importar calendario, sesiones y entradas.</w:t>
+      </w:r>
+    </w:p>
+    <w:p>
+      <w:pPr>
+        <w:pStyle w:val="Listaconvietas"/>
+      </w:pPr>
+      <w:r>
+        <w:t>Misiones: exportar/importar misiones.</w:t>
+      </w:r>
+    </w:p>
+    <w:p>
+      <w:pPr>
+        <w:pStyle w:val="Listaconvietas"/>
+      </w:pPr>
+      <w:r>
+        <w:t>Tiendas: exportar/importar tiendas completas.</w:t>
+      </w:r>
+    </w:p>
+    <w:p>
+      <w:pPr>
+        <w:pStyle w:val="Listaconvietas"/>
+      </w:pPr>
+      <w:r>
+        <w:t>Worldpedia: exportar/importar carpetas y notas.</w:t>
+      </w:r>
+    </w:p>
+    <w:p>
+      <w:pPr>
+        <w:pStyle w:val="Ttulo2"/>
+      </w:pPr>
+      <w:r>
+        <w:rPr>
+          <w:rFonts w:ascii="Calibri" w:hAnsi="Calibri"/>
+        </w:rPr>
+        <w:t>9</w:t>
+      </w:r>
+      <w:r>
+        <w:rPr>
+          <w:rFonts w:ascii="Calibri" w:hAnsi="Calibri"/>
+        </w:rPr>
+        <w:t>.2 Integración con domótica</w:t>
       </w:r>
     </w:p>
     <w:p>
@@ -3167,10 +3268,72 @@
         <w:spacing w:after="120"/>
       </w:pPr>
       <w:r>
+        <w:t>Puedes configurar integraciones con sistemas de domótica para crear ambientación inmersiva durante tus partidas:</w:t>
+      </w:r>
+    </w:p>
+    <w:p>
+      <w:pPr>
+        <w:pStyle w:val="Listaconvietas"/>
+      </w:pPr>
+      <w:r>
+        <w:t>Amazon Alexa.</w:t>
+      </w:r>
+    </w:p>
+    <w:p>
+      <w:pPr>
+        <w:pStyle w:val="Listaconvietas"/>
+      </w:pPr>
+      <w:r>
+        <w:t>Google Home.</w:t>
+      </w:r>
+    </w:p>
+    <w:p>
+      <w:pPr>
+        <w:pStyle w:val="Listaconvietas"/>
+      </w:pPr>
+      <w:r>
+        <w:t>Home Assistant.</w:t>
+      </w:r>
+    </w:p>
+    <w:p>
+      <w:pPr>
+        <w:pStyle w:val="Listaconvietas"/>
+      </w:pPr>
+      <w:r>
+        <w:t>Govee.</w:t>
+      </w:r>
+    </w:p>
+    <w:p>
+      <w:pPr>
+        <w:pStyle w:val="Listaconvietas"/>
+      </w:pPr>
+      <w:r>
+        <w:t>Philips Hue.</w:t>
+      </w:r>
+    </w:p>
+    <w:p>
+      <w:pPr>
+        <w:spacing w:after="120"/>
+      </w:pPr>
+      <w:r>
+        <w:t>Por ejemplo, al seleccionar un mapa o al comenzar una batalla, puedes configurar que las luces cambien de color, intensidad o ejecuten una rutina específica.</w:t>
+      </w:r>
+    </w:p>
+    <w:p>
+      <w:pPr>
+        <w:pStyle w:val="Ttulo2"/>
+      </w:pPr>
+      <w:r>
         <w:rPr>
-          <w:i/>
+          <w:rFonts w:ascii="Calibri" w:hAnsi="Calibri"/>
         </w:rPr>
-        <w:t>La filosofía detrás de este componente es:</w:t>
+        <w:t>9</w:t>
+      </w:r>
+      <w:r>
+        <w:rPr>
+          <w:rFonts w:ascii="Calibri" w:hAnsi="Calibri"/>
+        </w:rPr>
+        <w:t>.3 Múltiples resoluciones de imagen</w:t>
       </w:r>
     </w:p>
     <w:p>
@@ -3178,61 +3341,31 @@
         <w:spacing w:after="120"/>
       </w:pPr>
       <w:r>
-        <w:rPr>
-          <w:i/>
-        </w:rPr>
-        <w:t>"La mejor herramienta no es la que hace todo por ti. Es la que te recuerda lo que tú ya sabías… pero en el momento justo."</w:t>
-      </w:r>
-    </w:p>
-    <w:p>
-      <w:pPr>
-        <w:spacing w:after="120"/>
-      </w:pPr>
-      <w:r>
-        <w:rPr>
-          <w:b/>
-        </w:rPr>
-        <w:t>Recopila y muestra automáticamente:</w:t>
-      </w:r>
-    </w:p>
-    <w:p>
-      <w:pPr>
-        <w:pStyle w:val="Listaconvietas"/>
-      </w:pPr>
-      <w:r>
-        <w:t>Notas y marcadores relacionados con el mapa actual.</w:t>
-      </w:r>
-    </w:p>
-    <w:p>
-      <w:pPr>
-        <w:pStyle w:val="Listaconvietas"/>
-      </w:pPr>
-      <w:r>
-        <w:t>Información de los personajes en el encuentro activo.</w:t>
-      </w:r>
-    </w:p>
-    <w:p>
-      <w:pPr>
-        <w:pStyle w:val="Listaconvietas"/>
-      </w:pPr>
-      <w:r>
-        <w:t>Entradas de Worldpedia vinculadas a los elementos presentes.</w:t>
-      </w:r>
-    </w:p>
-    <w:p>
-      <w:pPr>
-        <w:pStyle w:val="Listaconvietas"/>
-      </w:pPr>
-      <w:r>
-        <w:t>Cualquier dato relevante que hayas vinculado previamente.</w:t>
-      </w:r>
-    </w:p>
-    <w:p>
-      <w:pPr>
-        <w:spacing w:after="120"/>
-      </w:pPr>
-      <w:r>
-        <w:t>Es una herramienta diseñada para que el máster no olvide detalles importantes en los momentos clave de la partida.</w:t>
+        <w:t>La app procesa y almacena cada imagen subida en tres resoluciones (baja, media y alta). Esto optimiza el uso de recursos:</w:t>
+      </w:r>
+    </w:p>
+    <w:p>
+      <w:pPr>
+        <w:pStyle w:val="Listaconvietas"/>
+      </w:pPr>
+      <w:r>
+        <w:t>Resolución baja: para listas y vistas previas.</w:t>
+      </w:r>
+    </w:p>
+    <w:p>
+      <w:pPr>
+        <w:pStyle w:val="Listaconvietas"/>
+      </w:pPr>
+      <w:r>
+        <w:t>Resolución media: para vista detallada en la ventana del máster.</w:t>
+      </w:r>
+    </w:p>
+    <w:p>
+      <w:pPr>
+        <w:pStyle w:val="Listaconvietas"/>
+      </w:pPr>
+      <w:r>
+        <w:t>Resolución alta: para las pantallas secundarias y proyecciones.</w:t>
       </w:r>
     </w:p>
     <w:p>
@@ -3249,109 +3382,19 @@
           <w:rFonts w:ascii="Calibri" w:hAnsi="Calibri"/>
         </w:rPr>
         <w:lastRenderedPageBreak/>
-        <w:t>10. Funcionalidades adicionales</w:t>
-      </w:r>
-    </w:p>
-    <w:p>
-      <w:pPr>
-        <w:pStyle w:val="Ttulo2"/>
-      </w:pPr>
+        <w:t>1</w:t>
+      </w:r>
       <w:r>
         <w:rPr>
           <w:rFonts w:ascii="Calibri" w:hAnsi="Calibri"/>
         </w:rPr>
-        <w:t>10.1 Importación/Exportación</w:t>
-      </w:r>
-    </w:p>
-    <w:p>
-      <w:pPr>
-        <w:spacing w:after="120"/>
-      </w:pPr>
-      <w:r>
-        <w:t>Muchas herramientas permiten importar y exportar datos en formato Excel (.xlsx):</w:t>
-      </w:r>
-    </w:p>
-    <w:p>
-      <w:pPr>
-        <w:pStyle w:val="Listaconvietas"/>
-      </w:pPr>
-      <w:r>
-        <w:t>Mapas: exportar/importar la lista completa con sus configuraciones.</w:t>
-      </w:r>
-    </w:p>
-    <w:p>
-      <w:pPr>
-        <w:pStyle w:val="Listaconvietas"/>
-      </w:pPr>
-      <w:r>
-        <w:t>Bestiario: exportar/importar entradas de enemigos.</w:t>
-      </w:r>
-    </w:p>
-    <w:p>
-      <w:pPr>
-        <w:pStyle w:val="Listaconvietas"/>
-      </w:pPr>
-      <w:r>
-        <w:t>Personajes: exportar/importar fichas de personajes.</w:t>
-      </w:r>
-    </w:p>
-    <w:p>
-      <w:pPr>
-        <w:pStyle w:val="Listaconvietas"/>
-      </w:pPr>
-      <w:r>
-        <w:t>Conjuros: exportar/importar la lista de hechizos.</w:t>
-      </w:r>
-    </w:p>
-    <w:p>
-      <w:pPr>
-        <w:pStyle w:val="Listaconvietas"/>
-      </w:pPr>
-      <w:r>
-        <w:t>Campañas: exportar/importar datos de campañas.</w:t>
-      </w:r>
-    </w:p>
-    <w:p>
-      <w:pPr>
-        <w:pStyle w:val="Listaconvietas"/>
-      </w:pPr>
-      <w:r>
-        <w:t>Diario: exportar/importar calendario, sesiones y entradas.</w:t>
-      </w:r>
-    </w:p>
-    <w:p>
-      <w:pPr>
-        <w:pStyle w:val="Listaconvietas"/>
-      </w:pPr>
-      <w:r>
-        <w:t>Misiones: exportar/importar misiones.</w:t>
-      </w:r>
-    </w:p>
-    <w:p>
-      <w:pPr>
-        <w:pStyle w:val="Listaconvietas"/>
-      </w:pPr>
-      <w:r>
-        <w:t>Tiendas: exportar/importar tiendas completas.</w:t>
-      </w:r>
-    </w:p>
-    <w:p>
-      <w:pPr>
-        <w:pStyle w:val="Listaconvietas"/>
-      </w:pPr>
-      <w:r>
-        <w:t>Worldpedia: exportar/importar carpetas y notas.</w:t>
-      </w:r>
-    </w:p>
-    <w:p>
-      <w:pPr>
-        <w:pStyle w:val="Ttulo2"/>
-      </w:pPr>
+        <w:t>0</w:t>
+      </w:r>
       <w:r>
         <w:rPr>
           <w:rFonts w:ascii="Calibri" w:hAnsi="Calibri"/>
         </w:rPr>
-        <w:t>10.2 Integración con domótica</w:t>
+        <w:t>. Acceso web y multi-dispositivo</w:t>
       </w:r>
     </w:p>
     <w:p>
@@ -3359,47 +3402,7 @@
         <w:spacing w:after="120"/>
       </w:pPr>
       <w:r>
-        <w:t>Puedes configurar integraciones con sistemas de domótica para crear ambientación inmersiva durante tus partidas:</w:t>
-      </w:r>
-    </w:p>
-    <w:p>
-      <w:pPr>
-        <w:pStyle w:val="Listaconvietas"/>
-      </w:pPr>
-      <w:r>
-        <w:t>Amazon Alexa.</w:t>
-      </w:r>
-    </w:p>
-    <w:p>
-      <w:pPr>
-        <w:pStyle w:val="Listaconvietas"/>
-      </w:pPr>
-      <w:r>
-        <w:t>Google Home.</w:t>
-      </w:r>
-    </w:p>
-    <w:p>
-      <w:pPr>
-        <w:pStyle w:val="Listaconvietas"/>
-      </w:pPr>
-      <w:r>
-        <w:t>Home Assistant.</w:t>
-      </w:r>
-    </w:p>
-    <w:p>
-      <w:pPr>
-        <w:pStyle w:val="Listaconvietas"/>
-      </w:pPr>
-      <w:r>
-        <w:t>Govee.</w:t>
-      </w:r>
-    </w:p>
-    <w:p>
-      <w:pPr>
-        <w:pStyle w:val="Listaconvietas"/>
-      </w:pPr>
-      <w:r>
-        <w:t>Philips Hue.</w:t>
+        <w:t>MasterHelp puede ejecutarse como aplicación de escritorio (Windows, Linux, Mac) o como aplicación web. En ambos casos, la base de datos es compartida.</w:t>
       </w:r>
     </w:p>
     <w:p>
@@ -3407,18 +3410,34 @@
         <w:spacing w:after="120"/>
       </w:pPr>
       <w:r>
-        <w:t>Por ejemplo, al seleccionar un mapa o al comenzar una batalla, puedes configurar que las luces cambien de color, intensidad o ejecuten una rutina específica.</w:t>
-      </w:r>
-    </w:p>
-    <w:p>
-      <w:pPr>
-        <w:pStyle w:val="Ttulo2"/>
-      </w:pPr>
-      <w:r>
         <w:rPr>
-          <w:rFonts w:ascii="Calibri" w:hAnsi="Calibri"/>
+          <w:b/>
         </w:rPr>
-        <w:t>10.3 Múltiples resoluciones de imagen</w:t>
+        <w:t>Cuando se ejecuta como aplicación de escritorio:</w:t>
+      </w:r>
+    </w:p>
+    <w:p>
+      <w:pPr>
+        <w:pStyle w:val="Listaconvietas"/>
+      </w:pPr>
+      <w:r>
+        <w:t>La app abre tres ventanas (principal, MAPAS y SKYLINE) que se sincronizan automáticamente.</w:t>
+      </w:r>
+    </w:p>
+    <w:p>
+      <w:pPr>
+        <w:pStyle w:val="Listaconvietas"/>
+      </w:pPr>
+      <w:r>
+        <w:t>Las ventanas secundarias se pueden arrastrar a monitores diferentes.</w:t>
+      </w:r>
+    </w:p>
+    <w:p>
+      <w:pPr>
+        <w:pStyle w:val="Listaconvietas"/>
+      </w:pPr>
+      <w:r>
+        <w:t>Usa Electron para la experiencia de escritorio nativa.</w:t>
       </w:r>
     </w:p>
     <w:p>
@@ -3426,31 +3445,58 @@
         <w:spacing w:after="120"/>
       </w:pPr>
       <w:r>
-        <w:t>La app procesa y almacena cada imagen subida en tres resoluciones (baja, media y alta). Esto optimiza el uso de recursos:</w:t>
-      </w:r>
-    </w:p>
-    <w:p>
-      <w:pPr>
-        <w:pStyle w:val="Listaconvietas"/>
-      </w:pPr>
-      <w:r>
-        <w:t>Resolución baja: para listas y vistas previas.</w:t>
-      </w:r>
-    </w:p>
-    <w:p>
-      <w:pPr>
-        <w:pStyle w:val="Listaconvietas"/>
-      </w:pPr>
-      <w:r>
-        <w:t>Resolución media: para vista detallada en la ventana del máster.</w:t>
-      </w:r>
-    </w:p>
-    <w:p>
-      <w:pPr>
-        <w:pStyle w:val="Listaconvietas"/>
-      </w:pPr>
-      <w:r>
-        <w:t>Resolución alta: para las pantallas secundarias y proyecciones.</w:t>
+        <w:rPr>
+          <w:b/>
+        </w:rPr>
+        <w:t>Cuando se usa la versión web:</w:t>
+      </w:r>
+    </w:p>
+    <w:p>
+      <w:pPr>
+        <w:pStyle w:val="Listaconvietas"/>
+      </w:pPr>
+      <w:r>
+        <w:t>La ventana principal y las secundarias se abren en pestañas separadas del navegador.</w:t>
+      </w:r>
+    </w:p>
+    <w:p>
+      <w:pPr>
+        <w:pStyle w:val="Listaconvietas"/>
+      </w:pPr>
+      <w:r>
+        <w:t>Puedes controlar lo que se ve en las pestañas secundarias desde la principal.</w:t>
+      </w:r>
+    </w:p>
+    <w:p>
+      <w:pPr>
+        <w:pStyle w:val="Listaconvietas"/>
+      </w:pPr>
+      <w:r>
+        <w:t>Cualquier dispositivo en la misma red puede acceder a la webapp.</w:t>
+      </w:r>
+    </w:p>
+    <w:p>
+      <w:pPr>
+        <w:pStyle w:val="Listaconvietas"/>
+      </w:pPr>
+      <w:r>
+        <w:t>Ideal para usar con proyectores, Smart TVs, Chromecast o tablets en la mesa.</w:t>
+      </w:r>
+    </w:p>
+    <w:p>
+      <w:pPr>
+        <w:pStyle w:val="Listaconvietas"/>
+      </w:pPr>
+      <w:r>
+        <w:t>Los jugadores pueden acceder desde sus propios dispositivos (móvil, tablet, portátil).</w:t>
+      </w:r>
+    </w:p>
+    <w:p>
+      <w:pPr>
+        <w:spacing w:after="120"/>
+      </w:pPr>
+      <w:r>
+        <w:t>La URL de acceso web se muestra en los ajustes del HOME, con opción de generar un código QR para un acceso rápido.</w:t>
       </w:r>
     </w:p>
     <w:p>
@@ -3467,126 +3513,19 @@
           <w:rFonts w:ascii="Calibri" w:hAnsi="Calibri"/>
         </w:rPr>
         <w:lastRenderedPageBreak/>
-        <w:t>11. Acceso web y multi-dispositivo</w:t>
-      </w:r>
-    </w:p>
-    <w:p>
-      <w:pPr>
-        <w:spacing w:after="120"/>
-      </w:pPr>
-      <w:r>
-        <w:t>MasterHelp puede ejecutarse como aplicación de escritorio (Windows, Linux, Mac) o como aplicación web. En ambos casos, la base de datos es compartida.</w:t>
-      </w:r>
-    </w:p>
-    <w:p>
-      <w:pPr>
-        <w:spacing w:after="120"/>
-      </w:pPr>
-      <w:r>
-        <w:rPr>
-          <w:b/>
-        </w:rPr>
-        <w:t>Cuando se ejecuta como aplicación de escritorio:</w:t>
-      </w:r>
-    </w:p>
-    <w:p>
-      <w:pPr>
-        <w:pStyle w:val="Listaconvietas"/>
-      </w:pPr>
-      <w:r>
-        <w:t>La app abre tres ventanas (principal, MAPAS y SKYLINE) que se sincronizan automáticamente.</w:t>
-      </w:r>
-    </w:p>
-    <w:p>
-      <w:pPr>
-        <w:pStyle w:val="Listaconvietas"/>
-      </w:pPr>
-      <w:r>
-        <w:t>Las ventanas secundarias se pueden arrastrar a monitores diferentes.</w:t>
-      </w:r>
-    </w:p>
-    <w:p>
-      <w:pPr>
-        <w:pStyle w:val="Listaconvietas"/>
-      </w:pPr>
-      <w:r>
-        <w:t>Usa Electron para la experiencia de escritorio nativa.</w:t>
-      </w:r>
-    </w:p>
-    <w:p>
-      <w:pPr>
-        <w:spacing w:after="120"/>
-      </w:pPr>
-      <w:r>
-        <w:rPr>
-          <w:b/>
-        </w:rPr>
-        <w:t>Cuando se usa la versión web:</w:t>
-      </w:r>
-    </w:p>
-    <w:p>
-      <w:pPr>
-        <w:pStyle w:val="Listaconvietas"/>
-      </w:pPr>
-      <w:r>
-        <w:t>La ventana principal y las secundarias se abren en pestañas separadas del navegador.</w:t>
-      </w:r>
-    </w:p>
-    <w:p>
-      <w:pPr>
-        <w:pStyle w:val="Listaconvietas"/>
-      </w:pPr>
-      <w:r>
-        <w:t>Puedes controlar lo que se ve en las pestañas secundarias desde la principal.</w:t>
-      </w:r>
-    </w:p>
-    <w:p>
-      <w:pPr>
-        <w:pStyle w:val="Listaconvietas"/>
-      </w:pPr>
-      <w:r>
-        <w:t>Cualquier dispositivo en la misma red puede acceder a la webapp.</w:t>
-      </w:r>
-    </w:p>
-    <w:p>
-      <w:pPr>
-        <w:pStyle w:val="Listaconvietas"/>
-      </w:pPr>
-      <w:r>
-        <w:t>Ideal para usar con proyectores, Smart TVs, Chromecast o tablets en la mesa.</w:t>
-      </w:r>
-    </w:p>
-    <w:p>
-      <w:pPr>
-        <w:pStyle w:val="Listaconvietas"/>
-      </w:pPr>
-      <w:r>
-        <w:t>Los jugadores pueden acceder desde sus propios dispositivos (móvil, tablet, portátil).</w:t>
-      </w:r>
-    </w:p>
-    <w:p>
-      <w:pPr>
-        <w:spacing w:after="120"/>
-      </w:pPr>
-      <w:r>
-        <w:t>La URL de acceso web se muestra en los ajustes del HOME, con opción de generar un código QR para un acceso rápido.</w:t>
-      </w:r>
-    </w:p>
-    <w:p>
-      <w:r>
-        <w:br w:type="page"/>
-      </w:r>
-    </w:p>
-    <w:p>
-      <w:pPr>
-        <w:pStyle w:val="Ttulo1"/>
-      </w:pPr>
+        <w:t>1</w:t>
+      </w:r>
       <w:r>
         <w:rPr>
           <w:rFonts w:ascii="Calibri" w:hAnsi="Calibri"/>
         </w:rPr>
-        <w:lastRenderedPageBreak/>
-        <w:t>12. Roles de usuario: Master vs Jugador</w:t>
+        <w:t>1</w:t>
+      </w:r>
+      <w:r>
+        <w:rPr>
+          <w:rFonts w:ascii="Calibri" w:hAnsi="Calibri"/>
+        </w:rPr>
+        <w:t>. Roles de usuario: Master vs Jugador</w:t>
       </w:r>
     </w:p>
     <w:p>

</xml_diff>